<commit_message>
docs: Add live Streamlit demo screenshot as Figure 6
Replaces the static KG background image in the report with a real
screenshot of the running Streamlit demo. The screenshot shows:
- the natural-language query "recommend a recent Adventure movie
  rated above 3 with Leonardo DiCaprio"
- the grounded answer (The Revenant)
- per-query latency (1.45s), selected model (llama-3.3-70b-versatile),
  and lexical grounding score (0.25)
- sidebar with model switcher, structured-log toggle, session memory
- KG visualization background

Updates:
- assets/demo_screenshot.png (new)
- README.md: embed demo screenshot under "Interactive UI"
- generate_report.py: swap Figure 6 source from knowledge_graph_bg.png
  to demo_screenshot.png; expanded caption
- report/Report_Final.pdf, report/Report_Final.docx: regenerated
</commit_message>
<xml_diff>
--- a/report/Report_Final.docx
+++ b/report/Report_Final.docx
@@ -1738,7 +1738,7 @@
       <w:r>
         <w:drawing>
           <wp:inline xmlns:a="http://schemas.openxmlformats.org/drawingml/2006/main" xmlns:pic="http://schemas.openxmlformats.org/drawingml/2006/picture">
-            <wp:extent cx="5029200" cy="3025378"/>
+            <wp:extent cx="5669280" cy="3388281"/>
             <wp:docPr id="6" name="Picture 6"/>
             <wp:cNvGraphicFramePr>
               <a:graphicFrameLocks noChangeAspect="1"/>
@@ -1747,7 +1747,7 @@
               <a:graphicData uri="http://schemas.openxmlformats.org/drawingml/2006/picture">
                 <pic:pic>
                   <pic:nvPicPr>
-                    <pic:cNvPr id="0" name="knowledge_graph_bg.png"/>
+                    <pic:cNvPr id="0" name="demo_screenshot.png"/>
                     <pic:cNvPicPr/>
                   </pic:nvPicPr>
                   <pic:blipFill>
@@ -1759,7 +1759,7 @@
                   <pic:spPr>
                     <a:xfrm>
                       <a:off x="0" y="0"/>
-                      <a:ext cx="5029200" cy="3025378"/>
+                      <a:ext cx="5669280" cy="3388281"/>
                     </a:xfrm>
                     <a:prstGeom prst="rect"/>
                   </pic:spPr>
@@ -1779,7 +1779,7 @@
           <w:i/>
           <w:sz w:val="20"/>
         </w:rPr>
-        <w:t>Figure 6. Knowledge-graph background used by the Streamlit demo, rendered from the (:Actor)-[:ACTED_IN]-&gt;(:Movie) subgraph.</w:t>
+        <w:t>Figure 6. Live demo of the Streamlit UI. The natural-language query "Can you recommend a recent Adventure movie rated above 3 with Leonardo DiCaprio" is answered with The Revenant, grounded in the retrieved KG facts. The sidebar exposes model switching and structured logging; the response card shows the per-query latency (1.45s), selected model (llama-3.3-70b-versatile), and the lexical grounding score (0.25). The knowledge-graph background is rendered from the (:Actor)-[:ACTED_IN]-&gt;(:Movie) subgraph for visual context.</w:t>
       </w:r>
     </w:p>
     <w:p>

</xml_diff>